<commit_message>
Labs sem AWS no Codespaces e migração para o GitHub
- Labs_MLOps: 12 labs (4 aulas x 3 partes, 10-15 min cada) rodando no
  GitHub Codespaces, sem dependência de AWS: MLflow local, Evidently,
  GitHub Actions, canary com FastAPI, Docker, registry local e Compose.
- Remove Labs_AWS_MLOps (continua no histórico e em Labs_AWS_MLOps.zip).
- .devcontainer e .gitignore na raiz.
- Slides: LAB PRÁTICO de cada parte alinhados aos novos labs; MLflow
  com aliases (@champion/@challenger) no lugar de estágios.
- Apostilas Aula01 e Aula02: aliases e log_model(..., name="model").
- README: links do GitHub e pré-requisitos sem conta AWS.

Co-Authored-By: Claude Opus 5.5 <noreply@anthropic.com>
</commit_message>
<xml_diff>
--- a/Docs-Aulas-MLOps/capitulos/Aula01_Ciclo_de_Vida_de_Modelos.docx
+++ b/Docs-Aulas-MLOps/capitulos/Aula01_Ciclo_de_Vida_de_Modelos.docx
@@ -141,23 +141,13 @@
           <w:lang w:val="en-US"/>
         </w:rPr>
       </w:pPr>
-      <w:proofErr w:type="spellStart"/>
       <w:r>
         <w:rPr>
           <w:rStyle w:val="SubTtulo-AutoreVersoChar"/>
           <w:b/>
           <w:lang w:val="en-US"/>
         </w:rPr>
-        <w:t>Versão</w:t>
-      </w:r>
-      <w:proofErr w:type="spellEnd"/>
-      <w:r>
-        <w:rPr>
-          <w:rStyle w:val="SubTtulo-AutoreVersoChar"/>
-          <w:b/>
-          <w:lang w:val="en-US"/>
-        </w:rPr>
-        <w:t xml:space="preserve"> 1</w:t>
+        <w:t xml:space="preserve">Versão 1</w:t>
       </w:r>
     </w:p>
     <w:p>
@@ -190,21 +180,7 @@
           <w:b/>
         </w:rPr>
         <w:lastRenderedPageBreak/>
-        <w:t>HISTÓRI</w:t>
-      </w:r>
-      <w:r>
-        <w:rPr>
-          <w:rStyle w:val="SubTtulo-AutoreVersoChar"/>
-          <w:b/>
-        </w:rPr>
-        <w:t>C</w:t>
-      </w:r>
-      <w:r>
-        <w:rPr>
-          <w:rStyle w:val="SubTtulo-AutoreVersoChar"/>
-          <w:b/>
-        </w:rPr>
-        <w:t>O DE REVISÕES</w:t>
+        <w:t>HISTÓRICO DE REVISÕES</w:t>
       </w:r>
     </w:p>
     <w:tbl>
@@ -399,15 +375,11 @@
           </w:tcPr>
           <w:p>
             <w:pPr>
-              <w:pStyle w:val="NormalTabela"/>
-              <w:rPr>
-                <w:rStyle w:val="SubTtulo-AutoreVersoChar"/>
-                <w:b w:val="0"/>
-                <w:bCs w:val="0"/>
-                <w:sz w:val="20"/>
-                <w:szCs w:val="16"/>
-              </w:rPr>
+              <w:ind w:firstLine="0"/>
             </w:pPr>
+            <w:r>
+              <w:t>2</w:t>
+            </w:r>
           </w:p>
         </w:tc>
         <w:tc>
@@ -415,16 +387,9 @@
             <w:tcW w:w="1174" w:type="pct"/>
           </w:tcPr>
           <w:p>
-            <w:pPr>
-              <w:pStyle w:val="NormalTabela"/>
-              <w:rPr>
-                <w:rStyle w:val="SubTtulo-AutoreVersoChar"/>
-                <w:b w:val="0"/>
-                <w:bCs w:val="0"/>
-                <w:sz w:val="20"/>
-                <w:szCs w:val="16"/>
-              </w:rPr>
-            </w:pPr>
+            <w:r>
+              <w:t>28/09/2026</w:t>
+            </w:r>
           </w:p>
         </w:tc>
         <w:tc>
@@ -433,15 +398,11 @@
           </w:tcPr>
           <w:p>
             <w:pPr>
-              <w:pStyle w:val="NormalTabela"/>
-              <w:rPr>
-                <w:rStyle w:val="SubTtulo-AutoreVersoChar"/>
-                <w:b w:val="0"/>
-                <w:bCs w:val="0"/>
-                <w:sz w:val="20"/>
-                <w:szCs w:val="16"/>
-              </w:rPr>
+              <w:ind w:firstLine="0"/>
             </w:pPr>
+            <w:r>
+              <w:t>Rafael Tavares</w:t>
+            </w:r>
           </w:p>
         </w:tc>
         <w:tc>
@@ -450,15 +411,11 @@
           </w:tcPr>
           <w:p>
             <w:pPr>
-              <w:pStyle w:val="NormalTabela"/>
-              <w:rPr>
-                <w:rStyle w:val="SubTtulo-AutoreVersoChar"/>
-                <w:b w:val="0"/>
-                <w:bCs w:val="0"/>
-                <w:sz w:val="20"/>
-                <w:szCs w:val="16"/>
-              </w:rPr>
+              <w:ind w:firstLine="0"/>
             </w:pPr>
+            <w:r>
+              <w:t>MLflow Model Registry: estágios substituídos por aliases (@champion/@challenger)</w:t>
+            </w:r>
           </w:p>
         </w:tc>
       </w:tr>
@@ -1287,17 +1244,8 @@
                           <w:rFonts w:eastAsia="Arial"/>
                           <w:sz w:val="18"/>
                         </w:rPr>
-                        <w:t xml:space="preserve">                   x MB ; </w:t>
+                        <w:t xml:space="preserve">                   x MB ; ePUB</w:t>
                       </w:r>
-                      <w:proofErr w:type="spellStart"/>
-                      <w:r>
-                        <w:rPr>
-                          <w:rFonts w:eastAsia="Arial"/>
-                          <w:sz w:val="18"/>
-                        </w:rPr>
-                        <w:t>ePUB</w:t>
-                      </w:r>
-                      <w:proofErr w:type="spellEnd"/>
                     </w:p>
                     <w:p>
                       <w:pPr>
@@ -1461,8 +1409,6 @@
       </w:r>
       <w:r>
         <w:t xml:space="preserve">FICHA CATALOGRÁFICA </w:t>
-      </w:r>
-      <w:r>
         <w:br/>
       </w:r>
       <w:r>
@@ -1470,21 +1416,7 @@
           <w:b/>
           <w:color w:val="FF0000"/>
         </w:rPr>
-        <w:t>[NÃO PREENCHER - PARA USO DO DEPTO DE EAD</w:t>
-      </w:r>
-      <w:r>
-        <w:rPr>
-          <w:b/>
-          <w:color w:val="FF0000"/>
-        </w:rPr>
-        <w:t xml:space="preserve"> E BIBLIOTECA</w:t>
-      </w:r>
-      <w:r>
-        <w:rPr>
-          <w:b/>
-          <w:color w:val="FF0000"/>
-        </w:rPr>
-        <w:t>]</w:t>
+        <w:t xml:space="preserve">[NÃO PREENCHER - PARA USO DO DEPTO DE EAD E BIBLIOTECA]</w:t>
       </w:r>
     </w:p>
     <w:p>
@@ -1536,11 +1468,7 @@
       </w:pPr>
       <w:r>
         <w:fldChar w:fldCharType="begin"/>
-      </w:r>
-      <w:r>
         <w:instrText xml:space="preserve"> TOC \o "1-3" \h \z \u </w:instrText>
-      </w:r>
-      <w:r>
         <w:fldChar w:fldCharType="separate"/>
       </w:r>
       <w:hyperlink w:anchor="_Toc153545379" w:history="1">
@@ -1555,40 +1483,10 @@
             <w:webHidden/>
           </w:rPr>
           <w:tab/>
-        </w:r>
-        <w:r>
-          <w:rPr>
-            <w:webHidden/>
-          </w:rPr>
           <w:fldChar w:fldCharType="begin"/>
-        </w:r>
-        <w:r>
-          <w:rPr>
-            <w:webHidden/>
-          </w:rPr>
           <w:instrText xml:space="preserve"> PAGEREF _Toc153545379 \h </w:instrText>
-        </w:r>
-        <w:r>
-          <w:rPr>
-            <w:webHidden/>
-          </w:rPr>
-        </w:r>
-        <w:r>
-          <w:rPr>
-            <w:webHidden/>
-          </w:rPr>
           <w:fldChar w:fldCharType="separate"/>
-        </w:r>
-        <w:r>
-          <w:rPr>
-            <w:webHidden/>
-          </w:rPr>
           <w:t>5</w:t>
-        </w:r>
-        <w:r>
-          <w:rPr>
-            <w:webHidden/>
-          </w:rPr>
           <w:fldChar w:fldCharType="end"/>
         </w:r>
       </w:hyperlink>
@@ -1617,40 +1515,10 @@
             <w:webHidden/>
           </w:rPr>
           <w:tab/>
-        </w:r>
-        <w:r>
-          <w:rPr>
-            <w:webHidden/>
-          </w:rPr>
           <w:fldChar w:fldCharType="begin"/>
-        </w:r>
-        <w:r>
-          <w:rPr>
-            <w:webHidden/>
-          </w:rPr>
           <w:instrText xml:space="preserve"> PAGEREF _Toc153545380 \h </w:instrText>
-        </w:r>
-        <w:r>
-          <w:rPr>
-            <w:webHidden/>
-          </w:rPr>
-        </w:r>
-        <w:r>
-          <w:rPr>
-            <w:webHidden/>
-          </w:rPr>
           <w:fldChar w:fldCharType="separate"/>
-        </w:r>
-        <w:r>
-          <w:rPr>
-            <w:webHidden/>
-          </w:rPr>
           <w:t>6</w:t>
-        </w:r>
-        <w:r>
-          <w:rPr>
-            <w:webHidden/>
-          </w:rPr>
           <w:fldChar w:fldCharType="end"/>
         </w:r>
       </w:hyperlink>
@@ -1681,46 +1549,10 @@
             <w:webHidden/>
           </w:rPr>
           <w:tab/>
-        </w:r>
-        <w:r>
-          <w:rPr>
-            <w:noProof/>
-            <w:webHidden/>
-          </w:rPr>
           <w:fldChar w:fldCharType="begin"/>
-        </w:r>
-        <w:r>
-          <w:rPr>
-            <w:noProof/>
-            <w:webHidden/>
-          </w:rPr>
           <w:instrText xml:space="preserve"> PAGEREF _Toc153545381 \h </w:instrText>
-        </w:r>
-        <w:r>
-          <w:rPr>
-            <w:noProof/>
-            <w:webHidden/>
-          </w:rPr>
-        </w:r>
-        <w:r>
-          <w:rPr>
-            <w:noProof/>
-            <w:webHidden/>
-          </w:rPr>
           <w:fldChar w:fldCharType="separate"/>
-        </w:r>
-        <w:r>
-          <w:rPr>
-            <w:noProof/>
-            <w:webHidden/>
-          </w:rPr>
           <w:t>9</w:t>
-        </w:r>
-        <w:r>
-          <w:rPr>
-            <w:noProof/>
-            <w:webHidden/>
-          </w:rPr>
           <w:fldChar w:fldCharType="end"/>
         </w:r>
       </w:hyperlink>
@@ -1751,46 +1583,10 @@
             <w:webHidden/>
           </w:rPr>
           <w:tab/>
-        </w:r>
-        <w:r>
-          <w:rPr>
-            <w:noProof/>
-            <w:webHidden/>
-          </w:rPr>
           <w:fldChar w:fldCharType="begin"/>
-        </w:r>
-        <w:r>
-          <w:rPr>
-            <w:noProof/>
-            <w:webHidden/>
-          </w:rPr>
           <w:instrText xml:space="preserve"> PAGEREF _Toc153545382 \h </w:instrText>
-        </w:r>
-        <w:r>
-          <w:rPr>
-            <w:noProof/>
-            <w:webHidden/>
-          </w:rPr>
-        </w:r>
-        <w:r>
-          <w:rPr>
-            <w:noProof/>
-            <w:webHidden/>
-          </w:rPr>
           <w:fldChar w:fldCharType="separate"/>
-        </w:r>
-        <w:r>
-          <w:rPr>
-            <w:noProof/>
-            <w:webHidden/>
-          </w:rPr>
           <w:t>17</w:t>
-        </w:r>
-        <w:r>
-          <w:rPr>
-            <w:noProof/>
-            <w:webHidden/>
-          </w:rPr>
           <w:fldChar w:fldCharType="end"/>
         </w:r>
       </w:hyperlink>
@@ -1821,46 +1617,10 @@
             <w:webHidden/>
           </w:rPr>
           <w:tab/>
-        </w:r>
-        <w:r>
-          <w:rPr>
-            <w:noProof/>
-            <w:webHidden/>
-          </w:rPr>
           <w:fldChar w:fldCharType="begin"/>
-        </w:r>
-        <w:r>
-          <w:rPr>
-            <w:noProof/>
-            <w:webHidden/>
-          </w:rPr>
           <w:instrText xml:space="preserve"> PAGEREF _Toc153545383 \h </w:instrText>
-        </w:r>
-        <w:r>
-          <w:rPr>
-            <w:noProof/>
-            <w:webHidden/>
-          </w:rPr>
-        </w:r>
-        <w:r>
-          <w:rPr>
-            <w:noProof/>
-            <w:webHidden/>
-          </w:rPr>
           <w:fldChar w:fldCharType="separate"/>
-        </w:r>
-        <w:r>
-          <w:rPr>
-            <w:noProof/>
-            <w:webHidden/>
-          </w:rPr>
           <w:t>18</w:t>
-        </w:r>
-        <w:r>
-          <w:rPr>
-            <w:noProof/>
-            <w:webHidden/>
-          </w:rPr>
           <w:fldChar w:fldCharType="end"/>
         </w:r>
       </w:hyperlink>
@@ -1890,40 +1650,10 @@
             <w:webHidden/>
           </w:rPr>
           <w:tab/>
-        </w:r>
-        <w:r>
-          <w:rPr>
-            <w:webHidden/>
-          </w:rPr>
           <w:fldChar w:fldCharType="begin"/>
-        </w:r>
-        <w:r>
-          <w:rPr>
-            <w:webHidden/>
-          </w:rPr>
           <w:instrText xml:space="preserve"> PAGEREF _Toc153545384 \h </w:instrText>
-        </w:r>
-        <w:r>
-          <w:rPr>
-            <w:webHidden/>
-          </w:rPr>
-        </w:r>
-        <w:r>
-          <w:rPr>
-            <w:webHidden/>
-          </w:rPr>
           <w:fldChar w:fldCharType="separate"/>
-        </w:r>
-        <w:r>
-          <w:rPr>
-            <w:webHidden/>
-          </w:rPr>
           <w:t>19</w:t>
-        </w:r>
-        <w:r>
-          <w:rPr>
-            <w:webHidden/>
-          </w:rPr>
           <w:fldChar w:fldCharType="end"/>
         </w:r>
       </w:hyperlink>
@@ -1952,40 +1682,10 @@
             <w:webHidden/>
           </w:rPr>
           <w:tab/>
-        </w:r>
-        <w:r>
-          <w:rPr>
-            <w:webHidden/>
-          </w:rPr>
           <w:fldChar w:fldCharType="begin"/>
-        </w:r>
-        <w:r>
-          <w:rPr>
-            <w:webHidden/>
-          </w:rPr>
           <w:instrText xml:space="preserve"> PAGEREF _Toc153545385 \h </w:instrText>
-        </w:r>
-        <w:r>
-          <w:rPr>
-            <w:webHidden/>
-          </w:rPr>
-        </w:r>
-        <w:r>
-          <w:rPr>
-            <w:webHidden/>
-          </w:rPr>
           <w:fldChar w:fldCharType="separate"/>
-        </w:r>
-        <w:r>
-          <w:rPr>
-            <w:webHidden/>
-          </w:rPr>
           <w:t>21</w:t>
-        </w:r>
-        <w:r>
-          <w:rPr>
-            <w:webHidden/>
-          </w:rPr>
           <w:fldChar w:fldCharType="end"/>
         </w:r>
       </w:hyperlink>
@@ -2723,21 +2423,7 @@
         <w:rPr>
           <w:b/>
         </w:rPr>
-        <w:t xml:space="preserve">garbage </w:t>
-      </w:r>
-      <w:proofErr w:type="gramStart"/>
-      <w:r>
-        <w:rPr>
-          <w:b/>
-        </w:rPr>
-        <w:t>in, garbage</w:t>
-      </w:r>
-      <w:proofErr w:type="gramEnd"/>
-      <w:r>
-        <w:rPr>
-          <w:b/>
-        </w:rPr>
-        <w:t xml:space="preserve"> out</w:t>
+        <w:t xml:space="preserve">garbage in, garbage out</w:t>
       </w:r>
       <w:r>
         <w:t>. Nenhum algoritmo sofisticado compensa dados de má qualidade.</w:t>
@@ -3111,13 +2797,8 @@
               <w:ind w:firstLine="0"/>
             </w:pPr>
             <w:r>
-              <w:t xml:space="preserve">Ecossistema </w:t>
+              <w:t xml:space="preserve">Ecossistema TensorFlow</w:t>
             </w:r>
-            <w:proofErr w:type="spellStart"/>
-            <w:r>
-              <w:t>TensorFlow</w:t>
-            </w:r>
-            <w:proofErr w:type="spellEnd"/>
           </w:p>
         </w:tc>
         <w:tc>
@@ -3129,13 +2810,8 @@
               <w:ind w:firstLine="0"/>
             </w:pPr>
             <w:r>
-              <w:t xml:space="preserve">Completo, TF </w:t>
+              <w:t xml:space="preserve">Completo, TF Serving</w:t>
             </w:r>
-            <w:proofErr w:type="spellStart"/>
-            <w:r>
-              <w:t>Serving</w:t>
-            </w:r>
-            <w:proofErr w:type="spellEnd"/>
           </w:p>
         </w:tc>
       </w:tr>
@@ -3148,11 +2824,9 @@
             <w:pPr>
               <w:ind w:firstLine="0"/>
             </w:pPr>
-            <w:proofErr w:type="spellStart"/>
             <w:r>
               <w:t>TorchScript</w:t>
             </w:r>
-            <w:proofErr w:type="spellEnd"/>
           </w:p>
         </w:tc>
         <w:tc>
@@ -3164,13 +2838,8 @@
               <w:ind w:firstLine="0"/>
             </w:pPr>
             <w:r>
-              <w:t xml:space="preserve">Ecossistema </w:t>
+              <w:t xml:space="preserve">Ecossistema PyTorch</w:t>
             </w:r>
-            <w:proofErr w:type="spellStart"/>
-            <w:r>
-              <w:t>PyTorch</w:t>
-            </w:r>
-            <w:proofErr w:type="spellEnd"/>
           </w:p>
         </w:tc>
         <w:tc>
@@ -3207,7 +2876,7 @@
         <w:t>Model Registry</w:t>
       </w:r>
       <w:r>
-        <w:t xml:space="preserve"> (ex: MLflow Model Registry) é o repositório central onde modelos versionados são armazenados, com metadados sobre performance, dados de treino e status (staging, production, archived).</w:t>
+        <w:t xml:space="preserve"> (ex: MLflow Model Registry) é o repositório central onde modelos versionados são armazenados, com metadados sobre performance, dados de treino e estado de promoção (ex.: os aliases @champion, para o modelo em produção, e @challenger, para o candidato em validação).</w:t>
       </w:r>
     </w:p>
     <w:p>

</xml_diff>